<commit_message>
fix inpuots to inputs
</commit_message>
<xml_diff>
--- a/experiments/learning rate tuning.docx
+++ b/experiments/learning rate tuning.docx
@@ -3,6 +3,19 @@
 <w:document xmlns:wpc="http://schemas.microsoft.com/office/word/2010/wordprocessingCanvas" xmlns:cx="http://schemas.microsoft.com/office/drawing/2014/chartex" xmlns:cx1="http://schemas.microsoft.com/office/drawing/2015/9/8/chartex" xmlns:cx2="http://schemas.microsoft.com/office/drawing/2015/10/21/chartex" xmlns:cx3="http://schemas.microsoft.com/office/drawing/2016/5/9/chartex" xmlns:cx4="http://schemas.microsoft.com/office/drawing/2016/5/10/chartex" xmlns:cx5="http://schemas.microsoft.com/office/drawing/2016/5/11/chartex" xmlns:cx6="http://schemas.microsoft.com/office/drawing/2016/5/12/chartex" xmlns:cx7="http://schemas.microsoft.com/office/drawing/2016/5/13/chartex" xmlns:cx8="http://schemas.microsoft.com/office/drawing/2016/5/14/chartex" xmlns:mc="http://schemas.openxmlformats.org/markup-compatibility/2006" xmlns:aink="http://schemas.microsoft.com/office/drawing/2016/ink" xmlns:am3d="http://schemas.microsoft.com/office/drawing/2017/model3d" xmlns:o="urn:schemas-microsoft-com:office:office" xmlns:oel="http://schemas.microsoft.com/office/2019/extlst" xmlns:r="http://schemas.openxmlformats.org/officeDocument/2006/relationships" xmlns:m="http://schemas.openxmlformats.org/officeDocument/2006/math" xmlns:v="urn:schemas-microsoft-com:vml" xmlns:wp14="http://schemas.microsoft.com/office/word/2010/wordprocessingDrawing" xmlns:wp="http://schemas.openxmlformats.org/drawingml/2006/wordprocessingDrawing" xmlns:w10="urn:schemas-microsoft-com:office:word" xmlns:w="http://schemas.openxmlformats.org/wordprocessingml/2006/main" xmlns:w14="http://schemas.microsoft.com/office/word/2010/wordml" xmlns:w15="http://schemas.microsoft.com/office/word/2012/wordml" xmlns:w16cex="http://schemas.microsoft.com/office/word/2018/wordml/cex" xmlns:w16cid="http://schemas.microsoft.com/office/word/2016/wordml/cid" xmlns:w16="http://schemas.microsoft.com/office/word/2018/wordml" xmlns:w16du="http://schemas.microsoft.com/office/word/2023/wordml/word16du" xmlns:w16sdtdh="http://schemas.microsoft.com/office/word/2020/wordml/sdtdatahash" xmlns:w16sdtfl="http://schemas.microsoft.com/office/word/2024/wordml/sdtformatlock" xmlns:w16se="http://schemas.microsoft.com/office/word/2015/wordml/symex" xmlns:wpg="http://schemas.microsoft.com/office/word/2010/wordprocessingGroup" xmlns:wpi="http://schemas.microsoft.com/office/word/2010/wordprocessingInk" xmlns:wne="http://schemas.microsoft.com/office/word/2006/wordml" xmlns:wps="http://schemas.microsoft.com/office/word/2010/wordprocessingShape" mc:Ignorable="w14 w15 w16se w16cid w16 w16cex w16sdtdh w16sdtfl w16du wp14">
   <w:body>
     <w:p>
+      <w:pPr>
+        <w:rPr>
+          <w:rFonts w:hint="eastAsia"/>
+        </w:rPr>
+      </w:pPr>
+      <w:r>
+        <w:rPr>
+          <w:rFonts w:hint="eastAsia"/>
+          <w:b/>
+          <w:bCs/>
+        </w:rPr>
+        <w:t>目标：</w:t>
+      </w:r>
       <w:r>
         <w:rPr>
           <w:rFonts w:hint="eastAsia"/>
@@ -11,9 +24,16 @@
       </w:r>
     </w:p>
     <w:p>
+      <w:pPr>
+        <w:rPr>
+          <w:rFonts w:hint="eastAsia"/>
+        </w:rPr>
+      </w:pPr>
       <w:r>
         <w:rPr>
           <w:rFonts w:hint="eastAsia"/>
+          <w:b/>
+          <w:bCs/>
         </w:rPr>
         <w:t>因变量：</w:t>
       </w:r>
@@ -25,46 +45,128 @@
       </w:r>
     </w:p>
     <w:p>
+      <w:pPr>
+        <w:rPr>
+          <w:rFonts w:hint="eastAsia"/>
+        </w:rPr>
+      </w:pPr>
       <w:r>
         <w:rPr>
           <w:rFonts w:hint="eastAsia"/>
-        </w:rPr>
-        <w:t>变量：learning rate, learning rate schedule strategy</w:t>
+          <w:b/>
+          <w:bCs/>
+        </w:rPr>
+        <w:t>变量：</w:t>
       </w:r>
-    </w:p>
-    <w:p/>
-    <w:p>
-      <w:pPr>
-        <w:rPr>
-          <w:rFonts w:hint="eastAsia"/>
-        </w:rPr>
-      </w:pPr>
       <w:r>
         <w:rPr>
           <w:rFonts w:hint="eastAsia"/>
         </w:rPr>
-        <w:t>实验一：线性增加max learning rate (使用cos+warmup策略)</w:t>
+        <w:t>learning rate, learning rate schedule strategy</w:t>
       </w:r>
     </w:p>
     <w:p>
+      <w:pPr>
+        <w:rPr>
+          <w:rFonts w:hint="eastAsia"/>
+        </w:rPr>
+      </w:pPr>
+    </w:p>
+    <w:p>
       <w:r>
         <w:rPr>
           <w:rFonts w:hint="eastAsia"/>
-        </w:rPr>
-        <w:t>Start_lr: 1e-5</w:t>
+          <w:b/>
+          <w:bCs/>
+        </w:rPr>
+        <w:t>实验</w:t>
+      </w:r>
+      <w:r>
+        <w:rPr>
+          <w:rFonts w:hint="eastAsia"/>
+        </w:rPr>
+        <w:t>：</w:t>
       </w:r>
     </w:p>
     <w:p>
       <w:pPr>
         <w:rPr>
-          <w:rFonts w:hint="eastAsia"/>
+          <w:u w:val="single"/>
         </w:rPr>
       </w:pPr>
       <w:r>
         <w:rPr>
           <w:rFonts w:hint="eastAsia"/>
-        </w:rPr>
-        <w:t>Interval：5e-6</w:t>
+          <w:u w:val="single"/>
+        </w:rPr>
+        <w:t>Learning rate schedule strategy:</w:t>
+      </w:r>
+    </w:p>
+    <w:p>
+      <w:pPr>
+        <w:rPr>
+          <w:rFonts w:hint="eastAsia"/>
+        </w:rPr>
+      </w:pPr>
+      <w:r>
+        <w:rPr>
+          <w:rFonts w:hint="eastAsia"/>
+        </w:rPr>
+        <w:t xml:space="preserve">Warmup + cos decay + final </w:t>
+      </w:r>
+    </w:p>
+    <w:p>
+      <w:pPr>
+        <w:rPr>
+          <w:rFonts w:hint="eastAsia"/>
+        </w:rPr>
+      </w:pPr>
+    </w:p>
+    <w:p>
+      <w:pPr>
+        <w:rPr>
+          <w:u w:val="single"/>
+        </w:rPr>
+      </w:pPr>
+      <w:r>
+        <w:rPr>
+          <w:rFonts w:hint="eastAsia"/>
+          <w:u w:val="single"/>
+        </w:rPr>
+        <w:t>Learning rate搜索策略：</w:t>
+      </w:r>
+    </w:p>
+    <w:p>
+      <w:pPr>
+        <w:pStyle w:val="a9"/>
+        <w:numPr>
+          <w:ilvl w:val="0"/>
+          <w:numId w:val="1"/>
+        </w:numPr>
+      </w:pPr>
+      <w:r>
+        <w:rPr>
+          <w:rFonts w:hint="eastAsia"/>
+        </w:rPr>
+        <w:t>先以*10为step size，在数量级上搜索</w:t>
+      </w:r>
+    </w:p>
+    <w:p>
+      <w:pPr>
+        <w:pStyle w:val="a9"/>
+        <w:numPr>
+          <w:ilvl w:val="0"/>
+          <w:numId w:val="1"/>
+        </w:numPr>
+        <w:rPr>
+          <w:rFonts w:hint="eastAsia"/>
+        </w:rPr>
+      </w:pPr>
+      <w:r>
+        <w:rPr>
+          <w:rFonts w:hint="eastAsia"/>
+        </w:rPr>
+        <w:t>在量级区间range内，以0.1/0.2 * range 为step size，在区间内fined-search</w:t>
       </w:r>
     </w:p>
     <w:sectPr>
@@ -133,6 +235,103 @@
     </w:p>
   </w:footnote>
 </w:footnotes>
+</file>
+
+<file path=word/numbering.xml><?xml version="1.0" encoding="utf-8"?>
+<w:numbering xmlns:wpc="http://schemas.microsoft.com/office/word/2010/wordprocessingCanvas" xmlns:cx="http://schemas.microsoft.com/office/drawing/2014/chartex" xmlns:cx1="http://schemas.microsoft.com/office/drawing/2015/9/8/chartex" xmlns:cx2="http://schemas.microsoft.com/office/drawing/2015/10/21/chartex" xmlns:cx3="http://schemas.microsoft.com/office/drawing/2016/5/9/chartex" xmlns:cx4="http://schemas.microsoft.com/office/drawing/2016/5/10/chartex" xmlns:cx5="http://schemas.microsoft.com/office/drawing/2016/5/11/chartex" xmlns:cx6="http://schemas.microsoft.com/office/drawing/2016/5/12/chartex" xmlns:cx7="http://schemas.microsoft.com/office/drawing/2016/5/13/chartex" xmlns:cx8="http://schemas.microsoft.com/office/drawing/2016/5/14/chartex" xmlns:mc="http://schemas.openxmlformats.org/markup-compatibility/2006" xmlns:aink="http://schemas.microsoft.com/office/drawing/2016/ink" xmlns:am3d="http://schemas.microsoft.com/office/drawing/2017/model3d" xmlns:o="urn:schemas-microsoft-com:office:office" xmlns:oel="http://schemas.microsoft.com/office/2019/extlst" xmlns:r="http://schemas.openxmlformats.org/officeDocument/2006/relationships" xmlns:m="http://schemas.openxmlformats.org/officeDocument/2006/math" xmlns:v="urn:schemas-microsoft-com:vml" xmlns:wp14="http://schemas.microsoft.com/office/word/2010/wordprocessingDrawing" xmlns:wp="http://schemas.openxmlformats.org/drawingml/2006/wordprocessingDrawing" xmlns:w10="urn:schemas-microsoft-com:office:word" xmlns:w="http://schemas.openxmlformats.org/wordprocessingml/2006/main" xmlns:w14="http://schemas.microsoft.com/office/word/2010/wordml" xmlns:w15="http://schemas.microsoft.com/office/word/2012/wordml" xmlns:w16cex="http://schemas.microsoft.com/office/word/2018/wordml/cex" xmlns:w16cid="http://schemas.microsoft.com/office/word/2016/wordml/cid" xmlns:w16="http://schemas.microsoft.com/office/word/2018/wordml" xmlns:w16du="http://schemas.microsoft.com/office/word/2023/wordml/word16du" xmlns:w16sdtdh="http://schemas.microsoft.com/office/word/2020/wordml/sdtdatahash" xmlns:w16sdtfl="http://schemas.microsoft.com/office/word/2024/wordml/sdtformatlock" xmlns:w16se="http://schemas.microsoft.com/office/word/2015/wordml/symex" xmlns:wpg="http://schemas.microsoft.com/office/word/2010/wordprocessingGroup" xmlns:wpi="http://schemas.microsoft.com/office/word/2010/wordprocessingInk" xmlns:wne="http://schemas.microsoft.com/office/word/2006/wordml" xmlns:wps="http://schemas.microsoft.com/office/word/2010/wordprocessingShape" mc:Ignorable="w14 w15 w16se w16cid w16 w16cex w16sdtdh w16sdtfl w16du wp14">
+  <w:abstractNum w:abstractNumId="0" w15:restartNumberingAfterBreak="0">
+    <w:nsid w:val="378F3044"/>
+    <w:multiLevelType w:val="hybridMultilevel"/>
+    <w:tmpl w:val="648014E8"/>
+    <w:lvl w:ilvl="0" w:tplc="A96C1E4A">
+      <w:start w:val="1"/>
+      <w:numFmt w:val="decimal"/>
+      <w:lvlText w:val="%1）"/>
+      <w:lvlJc w:val="left"/>
+      <w:pPr>
+        <w:ind w:left="360" w:hanging="360"/>
+      </w:pPr>
+      <w:rPr>
+        <w:rFonts w:hint="default"/>
+      </w:rPr>
+    </w:lvl>
+    <w:lvl w:ilvl="1" w:tplc="04090019" w:tentative="1">
+      <w:start w:val="1"/>
+      <w:numFmt w:val="lowerLetter"/>
+      <w:lvlText w:val="%2)"/>
+      <w:lvlJc w:val="left"/>
+      <w:pPr>
+        <w:ind w:left="880" w:hanging="440"/>
+      </w:pPr>
+    </w:lvl>
+    <w:lvl w:ilvl="2" w:tplc="0409001B" w:tentative="1">
+      <w:start w:val="1"/>
+      <w:numFmt w:val="lowerRoman"/>
+      <w:lvlText w:val="%3."/>
+      <w:lvlJc w:val="right"/>
+      <w:pPr>
+        <w:ind w:left="1320" w:hanging="440"/>
+      </w:pPr>
+    </w:lvl>
+    <w:lvl w:ilvl="3" w:tplc="0409000F" w:tentative="1">
+      <w:start w:val="1"/>
+      <w:numFmt w:val="decimal"/>
+      <w:lvlText w:val="%4."/>
+      <w:lvlJc w:val="left"/>
+      <w:pPr>
+        <w:ind w:left="1760" w:hanging="440"/>
+      </w:pPr>
+    </w:lvl>
+    <w:lvl w:ilvl="4" w:tplc="04090019" w:tentative="1">
+      <w:start w:val="1"/>
+      <w:numFmt w:val="lowerLetter"/>
+      <w:lvlText w:val="%5)"/>
+      <w:lvlJc w:val="left"/>
+      <w:pPr>
+        <w:ind w:left="2200" w:hanging="440"/>
+      </w:pPr>
+    </w:lvl>
+    <w:lvl w:ilvl="5" w:tplc="0409001B" w:tentative="1">
+      <w:start w:val="1"/>
+      <w:numFmt w:val="lowerRoman"/>
+      <w:lvlText w:val="%6."/>
+      <w:lvlJc w:val="right"/>
+      <w:pPr>
+        <w:ind w:left="2640" w:hanging="440"/>
+      </w:pPr>
+    </w:lvl>
+    <w:lvl w:ilvl="6" w:tplc="0409000F" w:tentative="1">
+      <w:start w:val="1"/>
+      <w:numFmt w:val="decimal"/>
+      <w:lvlText w:val="%7."/>
+      <w:lvlJc w:val="left"/>
+      <w:pPr>
+        <w:ind w:left="3080" w:hanging="440"/>
+      </w:pPr>
+    </w:lvl>
+    <w:lvl w:ilvl="7" w:tplc="04090019" w:tentative="1">
+      <w:start w:val="1"/>
+      <w:numFmt w:val="lowerLetter"/>
+      <w:lvlText w:val="%8)"/>
+      <w:lvlJc w:val="left"/>
+      <w:pPr>
+        <w:ind w:left="3520" w:hanging="440"/>
+      </w:pPr>
+    </w:lvl>
+    <w:lvl w:ilvl="8" w:tplc="0409001B" w:tentative="1">
+      <w:start w:val="1"/>
+      <w:numFmt w:val="lowerRoman"/>
+      <w:lvlText w:val="%9."/>
+      <w:lvlJc w:val="right"/>
+      <w:pPr>
+        <w:ind w:left="3960" w:hanging="440"/>
+      </w:pPr>
+    </w:lvl>
+  </w:abstractNum>
+  <w:num w:numId="1" w16cid:durableId="1053040810">
+    <w:abstractNumId w:val="0"/>
+  </w:num>
+</w:numbering>
 </file>
 
 <file path=word/styles.xml><?xml version="1.0" encoding="utf-8"?>

</xml_diff>